<commit_message>
Traits remeasured twice and repeatability measures calculated.
</commit_message>
<xml_diff>
--- a/word-style-template.docx
+++ b/word-style-template.docx
@@ -30,7 +30,7 @@
     </w:p>
     <w:p>
       <w:pPr>
-        <w:pStyle w:val="Heading1"/>
+        <w:pStyle w:val="Heading2"/>
       </w:pPr>
       <w:bookmarkStart w:id="0" w:name="r-markdown"/>
       <w:r>
@@ -1564,7 +1564,7 @@
     <w:uiPriority w:val="9"/>
     <w:unhideWhenUsed/>
     <w:qFormat/>
-    <w:rsid w:val="00CB0BD1"/>
+    <w:rsid w:val="001F2BCC"/>
     <w:pPr>
       <w:keepNext/>
       <w:keepLines/>
@@ -1576,6 +1576,7 @@
       <w:b/>
       <w:bCs/>
       <w:color w:val="000000" w:themeColor="text1"/>
+      <w:sz w:val="28"/>
       <w:szCs w:val="32"/>
     </w:rPr>
   </w:style>
@@ -1586,7 +1587,7 @@
     <w:uiPriority w:val="9"/>
     <w:unhideWhenUsed/>
     <w:qFormat/>
-    <w:rsid w:val="0090509B"/>
+    <w:rsid w:val="001F2BCC"/>
     <w:pPr>
       <w:keepNext/>
       <w:keepLines/>
@@ -1598,7 +1599,6 @@
       <w:b/>
       <w:bCs/>
       <w:color w:val="000000" w:themeColor="text1"/>
-      <w:sz w:val="28"/>
       <w:szCs w:val="28"/>
     </w:rPr>
   </w:style>
@@ -1609,7 +1609,7 @@
     <w:uiPriority w:val="9"/>
     <w:unhideWhenUsed/>
     <w:qFormat/>
-    <w:rsid w:val="00EE03BB"/>
+    <w:rsid w:val="001F2BCC"/>
     <w:pPr>
       <w:keepNext/>
       <w:keepLines/>
@@ -1620,8 +1620,8 @@
       <w:rFonts w:asciiTheme="majorHAnsi" w:eastAsiaTheme="majorEastAsia" w:hAnsiTheme="majorHAnsi" w:cstheme="majorBidi"/>
       <w:b/>
       <w:bCs/>
+      <w:i/>
       <w:color w:val="000000" w:themeColor="text1"/>
-      <w:sz w:val="32"/>
     </w:rPr>
   </w:style>
   <w:style w:type="paragraph" w:styleId="Heading5">

</xml_diff>